<commit_message>
.gitignore added and some files updated
</commit_message>
<xml_diff>
--- a/Assignment 16.docx
+++ b/Assignment 16.docx
@@ -1737,25 +1737,7 @@
           <w:sz w:val="28"/>
           <w:szCs w:val="28"/>
         </w:rPr>
-        <w:t xml:space="preserve">Table </w:t>
-      </w:r>
-      <w:proofErr w:type="gramStart"/>
-      <w:r>
-        <w:rPr>
-          <w:rFonts w:asciiTheme="minorHAnsi" w:hAnsiTheme="minorHAnsi" w:cstheme="minorHAnsi"/>
-          <w:sz w:val="28"/>
-          <w:szCs w:val="28"/>
-        </w:rPr>
-        <w:t>Type(</w:t>
-      </w:r>
-      <w:proofErr w:type="gramEnd"/>
-      <w:r>
-        <w:rPr>
-          <w:rFonts w:asciiTheme="minorHAnsi" w:hAnsiTheme="minorHAnsi" w:cstheme="minorHAnsi"/>
-          <w:sz w:val="28"/>
-          <w:szCs w:val="28"/>
-        </w:rPr>
-        <w:t xml:space="preserve">Radio Button)-&gt; </w:t>
+        <w:t xml:space="preserve">Table Type(Radio Button)-&gt; </w:t>
       </w:r>
       <w:r>
         <w:rPr>
@@ -2035,7 +2017,15 @@
           <w:szCs w:val="28"/>
           <w:lang w:val="en-US"/>
         </w:rPr>
-        <w:t>Object type: Type Group (old name of type pool)</w:t>
+        <w:t>Type Group</w:t>
+      </w:r>
+      <w:r>
+        <w:rPr>
+          <w:sz w:val="28"/>
+          <w:szCs w:val="28"/>
+          <w:lang w:val="en-US"/>
+        </w:rPr>
+        <w:t>.</w:t>
       </w:r>
     </w:p>
     <w:p>

</xml_diff>